<commit_message>
Eduardo Costa: revisão da Parte 5
Co-Authored-By: Claude Opus 5.5 <noreply@anthropic.com>
Claude-Session: https://claude.ai/code/session_01MJjUEEZrxQDEUifKK2vj9g
</commit_message>
<xml_diff>
--- a/roteiros/eduardo-costa/EduardoCosta_Parte5.docx
+++ b/roteiros/eduardo-costa/EduardoCosta_Parte5.docx
@@ -55,7 +55,7 @@
         <w:rPr>
           <w:color w:val="000000"/>
         </w:rPr>
-        <w:t>O noivado com Victória, aquele que terminou em meio a boatos de traição, voltou à tona. Naquela entrevista, o próprio Eduardo apontou o vício como um dos motivos do fim.</w:t>
+        <w:t>O noivado com Victória, aquele que terminou em meio a boatos de traição, voltou à tona. Naquela entrevista, o próprio Eduardo disse que o vício tinha prejudicado aquele relacionamento.</w:t>
       </w:r>
     </w:p>
     <w:p>
@@ -135,7 +135,7 @@
         <w:rPr>
           <w:color w:val="000000"/>
         </w:rPr>
-        <w:t>Segundo a imprensa especializada em sertanejo, foi esse caso que, um ano antes, tinha feito Leonardo decidir não dividir mais o palco com Eduardo. E até o cantor Marrone, da dupla com Bruno, chegou a ser chamado para depor no caso.</w:t>
+        <w:t>Segundo a imprensa especializada em sertanejo, uma acusação de estelionato envolvendo a negociação de uma casa já tinha pesado, em dois mil e vinte, na decisão de Leonardo de não dividir mais o palco com Eduardo. Nessa história, até o cantor Marrone, da dupla com Bruno, chegou a ser chamado para depor.</w:t>
       </w:r>
     </w:p>
     <w:p>
@@ -263,7 +263,7 @@
         <w:rPr>
           <w:color w:val="000000"/>
         </w:rPr>
-        <w:t>O homem que tinha prometido o fim da mamata estava usando a mesma lei que atacou.</w:t>
+        <w:t>O homem que tinha prometido o fim da mamata recebeu autorização para usar a mesma lei que atacou.</w:t>
       </w:r>
     </w:p>
     <w:p>
@@ -327,7 +327,7 @@
         <w:rPr>
           <w:color w:val="000000"/>
         </w:rPr>
-        <w:t>Em poucas horas, a notícia estava em todos os portais. Eduardo Costa pode ser preso.</w:t>
+        <w:t>Logo, a notícia estava nos principais portais do país. Eduardo Costa pode ser preso.</w:t>
       </w:r>
     </w:p>
     <w:p>
@@ -431,7 +431,7 @@
         <w:rPr>
           <w:color w:val="000000"/>
         </w:rPr>
-        <w:t>A ex-noiva e os áudios de ameaça. A amizade com Leonardo que acabou ao vivo. A casa de nove milhões. E uma frase digitada contra uma apresentadora de televisão, que virou condenação.</w:t>
+        <w:t>A ex-noiva e os áudios de ameaça atribuídos ao irmão dele. A amizade com Leonardo que acabou ao vivo. A casa de nove milhões. E uma frase digitada contra uma apresentadora de televisão, que virou condenação.</w:t>
       </w:r>
     </w:p>
     <w:p>

</xml_diff>